<commit_message>
Tighten reviewer package for Cell Reports Methods
</commit_message>
<xml_diff>
--- a/manuscript/KRT6a38985775af2.docx
+++ b/manuscript/KRT6a38985775af2.docx
@@ -1421,31 +1421,8 @@
             <w:vAlign w:val="top"/>
           </w:tcPr>
           <w:p>
-            <w:pPr>
-              <w:jc w:val="left"/>
-              <w:rPr>
-                <w:b w:val="0"/>
-                <w:bCs w:val="0"/>
-                <w:i w:val="0"/>
-                <w:iCs w:val="0"/>
-                <w:smallCaps w:val="0"/>
-                <w:color w:val="000000"/>
-                <w:sz w:val="20"/>
-                <w:szCs w:val="20"/>
-              </w:rPr>
-            </w:pPr>
-            <w:r>
-              <w:rPr>
-                <w:b w:val="0"/>
-                <w:bCs w:val="0"/>
-                <w:i w:val="0"/>
-                <w:iCs w:val="0"/>
-                <w:smallCaps w:val="0"/>
-                <w:color w:val="000000"/>
-                <w:sz w:val="20"/>
-                <w:szCs w:val="20"/>
-              </w:rPr>
-              <w:t>N/A</w:t>
+            <w:r>
+              <w:t>https://github.com/hhhhmx/GERM-BO.git</w:t>
             </w:r>
           </w:p>
         </w:tc>
@@ -2459,31 +2436,8 @@
             <w:vAlign w:val="top"/>
           </w:tcPr>
           <w:p>
-            <w:pPr>
-              <w:jc w:val="left"/>
-              <w:rPr>
-                <w:b w:val="0"/>
-                <w:bCs w:val="0"/>
-                <w:i w:val="0"/>
-                <w:iCs w:val="0"/>
-                <w:smallCaps w:val="0"/>
-                <w:color w:val="000000"/>
-                <w:sz w:val="20"/>
-                <w:szCs w:val="20"/>
-              </w:rPr>
-            </w:pPr>
-            <w:r>
-              <w:rPr>
-                <w:b w:val="0"/>
-                <w:bCs w:val="0"/>
-                <w:i w:val="0"/>
-                <w:iCs w:val="0"/>
-                <w:smallCaps w:val="0"/>
-                <w:color w:val="000000"/>
-                <w:sz w:val="20"/>
-                <w:szCs w:val="20"/>
-              </w:rPr>
-              <w:t>N/A</w:t>
+            <w:r>
+              <w:t>https://github.com/hhhhmx/GERM-BO.git</w:t>
             </w:r>
           </w:p>
         </w:tc>

</xml_diff>